<commit_message>
major gui, gui connections, and report merge refactoring, cleanup of PV Earnings Updated template, WC dynamic var names and values creation
</commit_message>
<xml_diff>
--- a/EconAutomation/src/supporting_docs/econ_report_templates/PV_Earnings_Report_Template_Updated.docx
+++ b/EconAutomation/src/supporting_docs/econ_report_templates/PV_Earnings_Report_Template_Updated.docx
@@ -1807,7 +1807,7 @@
           <w:sz w:val="24"/>
           <w:u w:val="single"/>
         </w:rPr>
-        <w:t>{{r WC_PV_summary_no_rounding_low }}</w:t>
+        <w:t>{{r PV_Summary_No_Rounding_Low }}</w:t>
       </w:r>
       <w:r>
         <w:rPr>
@@ -1822,7 +1822,7 @@
           <w:sz w:val="24"/>
           <w:u w:val="single"/>
         </w:rPr>
-        <w:t>{{r WC_PV_summary_no_rounding_high }}</w:t>
+        <w:t>{{r PV_Summary_No_Rounding_High }}</w:t>
       </w:r>
     </w:p>
     <w:p>
@@ -2601,7 +2601,7 @@
           <w:bCs/>
           <w:sz w:val="24"/>
         </w:rPr>
-        <w:t xml:space="preserve">After credit for {{ credit2_WLE_posttrial_adj }} (high post-trail EC), the loss from trial is </w:t>
+        <w:t xml:space="preserve">After credit for {{ credit2_WLE_posttrial_adj }} (high post-trial EC), the loss from trial is </w:t>
       </w:r>
       <w:r>
         <w:rPr>
@@ -3812,7 +3812,7 @@
           <w:bCs/>
           <w:sz w:val="24"/>
         </w:rPr>
-        <w:t xml:space="preserve">After credit for {{ credit2_WLE_posttrial_adj }} (high post-trail EC), the loss from trial is </w:t>
+        <w:t xml:space="preserve">After credit for {{ credit2_WLE_posttrial_adj }} (high post-trial EC), the loss from trial is </w:t>
       </w:r>
       <w:r>
         <w:rPr>
@@ -5024,7 +5024,7 @@
           <w:bCs/>
           <w:sz w:val="24"/>
         </w:rPr>
-        <w:t xml:space="preserve">After credit for {{ credit2_TR_posttrial_adj }} (high post-trail EC), the loss from trial is </w:t>
+        <w:t xml:space="preserve">After credit for {{ credit2_TR_posttrial_adj }} (high post-trial EC), the loss from trial is </w:t>
       </w:r>
       <w:r>
         <w:rPr>
@@ -6235,7 +6235,7 @@
           <w:bCs/>
           <w:sz w:val="24"/>
         </w:rPr>
-        <w:t xml:space="preserve">After credit for {{ credit2_TR_posttrial_adj }} (high post-trail EC), the loss from trial is </w:t>
+        <w:t xml:space="preserve">After credit for {{ credit2_TR_posttrial_adj }} (high post-trial EC), the loss from trial is </w:t>
       </w:r>
       <w:r>
         <w:rPr>
@@ -7446,7 +7446,7 @@
           <w:bCs/>
           <w:sz w:val="24"/>
         </w:rPr>
-        <w:t xml:space="preserve">After credit for {{ credit2_TR_posttrial_adj }} (high post-trail EC), the loss from trial is </w:t>
+        <w:t xml:space="preserve">After credit for {{ credit2_TR_posttrial_adj }} (high post-trial EC), the loss from trial is </w:t>
       </w:r>
       <w:r>
         <w:rPr>
@@ -10433,7 +10433,7 @@
           <w:bCs/>
           <w:sz w:val="24"/>
         </w:rPr>
-        <w:t>{{ b1e_eff_tax_rate }}%.</w:t>
+        <w:t>{{ b1e_eff_tax_rate }}%.{% endif %}</w:t>
       </w:r>
     </w:p>
     <w:p>
@@ -12467,7 +12467,7 @@
         <w:rPr>
           <w:rFonts w:ascii="TimesNewRomanPS-ItalicMT" w:hAnsi="TimesNewRomanPS-ItalicMT" w:cs="TimesNewRomanPS-ItalicMT"/>
         </w:rPr>
-        <w:t>{%p if 'LCP' in rehab_report_types and ('PVLCP' in report_templates or 'PV Earnings with Medicals' in report_templates) %}</w:t>
+        <w:t>{%p if 'LCP' in rehab_report_types %}</w:t>
       </w:r>
     </w:p>
     <w:p>
@@ -12649,7 +12649,7 @@
           <w:rFonts w:ascii="TimesNewRomanPS-ItalicMT" w:hAnsi="TimesNewRomanPS-ItalicMT" w:cs="TimesNewRomanPS-ItalicMT"/>
         </w:rPr>
         <w:lastRenderedPageBreak/>
-        <w:t>{%p if 'LCP' in rehab_report_types and ('PVLCP' in report_templates or 'PV Earnings with Medicals' in report_templates) %}</w:t>
+        <w:t>{%p if 'LCP' in rehab_report_types %}</w:t>
       </w:r>
     </w:p>
     <w:p>

</xml_diff>